<commit_message>
report, presentation, and analysis plan
</commit_message>
<xml_diff>
--- a/Project 0/Background/Project 0 Description.docx
+++ b/Project 0/Background/Project 0 Description.docx
@@ -2,9 +2,662 @@
 <file path=word/document.xml><?xml version="1.0" encoding="utf-8"?>
 <w:document xmlns:wpc="http://schemas.microsoft.com/office/word/2010/wordprocessingCanvas" xmlns:mc="http://schemas.openxmlformats.org/markup-compatibility/2006" xmlns:o="urn:schemas-microsoft-com:office:office" xmlns:r="http://schemas.openxmlformats.org/officeDocument/2006/relationships" xmlns:m="http://schemas.openxmlformats.org/officeDocument/2006/math" xmlns:v="urn:schemas-microsoft-com:vml" xmlns:wp14="http://schemas.microsoft.com/office/word/2010/wordprocessingDrawing" xmlns:wp="http://schemas.openxmlformats.org/drawingml/2006/wordprocessingDrawing" xmlns:w10="urn:schemas-microsoft-com:office:word" xmlns:w="http://schemas.openxmlformats.org/wordprocessingml/2006/main" xmlns:w14="http://schemas.microsoft.com/office/word/2010/wordml" xmlns:w15="http://schemas.microsoft.com/office/word/2012/wordml" xmlns:wpg="http://schemas.microsoft.com/office/word/2010/wordprocessingGroup" xmlns:wpi="http://schemas.microsoft.com/office/word/2010/wordprocessingInk" xmlns:wne="http://schemas.microsoft.com/office/word/2006/wordml" xmlns:wps="http://schemas.microsoft.com/office/word/2010/wordprocessingShape" xmlns:w16se="http://schemas.microsoft.com/office/word/2015/wordml/symex" xmlns:w16cid="http://schemas.microsoft.com/office/word/2016/wordml/cid" xmlns:w16="http://schemas.microsoft.com/office/word/2018/wordml" xmlns:w16cex="http://schemas.microsoft.com/office/word/2018/wordml/cex" xmlns:w16sdtdh="http://schemas.microsoft.com/office/word/2020/wordml/sdtdatahash" xmlns:w16sdtfl="http://schemas.microsoft.com/office/word/2024/wordml/sdtformatlock" mc:Ignorable="w14 w15 wp14 w16se w16cid w16 w16cex w16sdtdh w16sdtfl">
   <w:body>
-    <w:p xmlns:wp14="http://schemas.microsoft.com/office/word/2010/wordml" wp14:paraId="2C078E63" wp14:textId="77777777"/>
+    <w:p xmlns:wp14="http://schemas.microsoft.com/office/word/2010/wordml" wp14:paraId="72D464CA" wp14:textId="1C2499F6">
+      <w:pPr>
+        <w:shd w:val="clear" w:color="auto" w:fill="FFFFFF" w:themeFill="background1"/>
+        <w:spacing w:before="180" w:beforeAutospacing="off" w:after="180" w:afterAutospacing="off"/>
+      </w:pPr>
+      <w:r>
+        <w:rPr>
+          <w:rFonts w:ascii="Lato" w:hAnsi="Lato" w:eastAsia="Lato" w:cs="Lato"/>
+          <w:b w:val="1"/>
+          <w:bCs w:val="1"/>
+          <w:i w:val="0"/>
+          <w:iCs w:val="0"/>
+          <w:caps w:val="0"/>
+          <w:smallCaps w:val="0"/>
+          <w:noProof w:val="0"/>
+          <w:color w:val="273540"/>
+          <w:sz w:val="24"/>
+          <w:szCs w:val="24"/>
+          <w:lang w:val="en-US"/>
+        </w:rPr>
+        <w:t>Background:</w:t>
+      </w:r>
+      <w:r>
+        <w:rPr>
+          <w:rFonts w:ascii="Lato" w:hAnsi="Lato" w:eastAsia="Lato" w:cs="Lato"/>
+          <w:b w:val="0"/>
+          <w:bCs w:val="0"/>
+          <w:i w:val="0"/>
+          <w:iCs w:val="0"/>
+          <w:caps w:val="0"/>
+          <w:smallCaps w:val="0"/>
+          <w:noProof w:val="0"/>
+          <w:color w:val="273540"/>
+          <w:sz w:val="24"/>
+          <w:szCs w:val="24"/>
+          <w:lang w:val="en-US"/>
+        </w:rPr>
+        <w:t xml:space="preserve"> Cortisol and DHEA are two hormones that regulate our stress system. Cortisol is known to have a peak shortly after waking and then falls over the day to a low in the evening. Features of this diurnal pattern have been implicated in depression, sleep </w:t>
+      </w:r>
+      <w:r>
+        <w:rPr>
+          <w:rFonts w:ascii="Lato" w:hAnsi="Lato" w:eastAsia="Lato" w:cs="Lato"/>
+          <w:b w:val="0"/>
+          <w:bCs w:val="0"/>
+          <w:i w:val="0"/>
+          <w:iCs w:val="0"/>
+          <w:caps w:val="0"/>
+          <w:smallCaps w:val="0"/>
+          <w:noProof w:val="0"/>
+          <w:color w:val="273540"/>
+          <w:sz w:val="24"/>
+          <w:szCs w:val="24"/>
+          <w:lang w:val="en-US"/>
+        </w:rPr>
+        <w:t>disorders</w:t>
+      </w:r>
+      <w:r>
+        <w:rPr>
+          <w:rFonts w:ascii="Lato" w:hAnsi="Lato" w:eastAsia="Lato" w:cs="Lato"/>
+          <w:b w:val="0"/>
+          <w:bCs w:val="0"/>
+          <w:i w:val="0"/>
+          <w:iCs w:val="0"/>
+          <w:caps w:val="0"/>
+          <w:smallCaps w:val="0"/>
+          <w:noProof w:val="0"/>
+          <w:color w:val="273540"/>
+          <w:sz w:val="24"/>
+          <w:szCs w:val="24"/>
+          <w:lang w:val="en-US"/>
+        </w:rPr>
+        <w:t xml:space="preserve"> and many other conditions. Being able to collect samples to measure this curve in a natural environment (</w:t>
+      </w:r>
+      <w:r>
+        <w:rPr>
+          <w:rFonts w:ascii="Lato" w:hAnsi="Lato" w:eastAsia="Lato" w:cs="Lato"/>
+          <w:b w:val="0"/>
+          <w:bCs w:val="0"/>
+          <w:i w:val="0"/>
+          <w:iCs w:val="0"/>
+          <w:caps w:val="0"/>
+          <w:smallCaps w:val="0"/>
+          <w:noProof w:val="0"/>
+          <w:color w:val="273540"/>
+          <w:sz w:val="24"/>
+          <w:szCs w:val="24"/>
+          <w:lang w:val="en-US"/>
+        </w:rPr>
+        <w:t>e.g.</w:t>
+      </w:r>
+      <w:r>
+        <w:rPr>
+          <w:rFonts w:ascii="Lato" w:hAnsi="Lato" w:eastAsia="Lato" w:cs="Lato"/>
+          <w:b w:val="0"/>
+          <w:bCs w:val="0"/>
+          <w:i w:val="0"/>
+          <w:iCs w:val="0"/>
+          <w:caps w:val="0"/>
+          <w:smallCaps w:val="0"/>
+          <w:noProof w:val="0"/>
+          <w:color w:val="273540"/>
+          <w:sz w:val="24"/>
+          <w:szCs w:val="24"/>
+          <w:lang w:val="en-US"/>
+        </w:rPr>
+        <w:t xml:space="preserve"> at home) is useful for research on this endocrine system. The accuracy of saliva sample collection is crucial to obtaining reliable characterization of the cortisol awakening response and </w:t>
+      </w:r>
+      <w:r>
+        <w:rPr>
+          <w:rFonts w:ascii="Lato" w:hAnsi="Lato" w:eastAsia="Lato" w:cs="Lato"/>
+          <w:b w:val="0"/>
+          <w:bCs w:val="0"/>
+          <w:i w:val="0"/>
+          <w:iCs w:val="0"/>
+          <w:caps w:val="0"/>
+          <w:smallCaps w:val="0"/>
+          <w:noProof w:val="0"/>
+          <w:color w:val="273540"/>
+          <w:sz w:val="24"/>
+          <w:szCs w:val="24"/>
+          <w:lang w:val="en-US"/>
+        </w:rPr>
+        <w:t>perhaps defining</w:t>
+      </w:r>
+      <w:r>
+        <w:rPr>
+          <w:rFonts w:ascii="Lato" w:hAnsi="Lato" w:eastAsia="Lato" w:cs="Lato"/>
+          <w:b w:val="0"/>
+          <w:bCs w:val="0"/>
+          <w:i w:val="0"/>
+          <w:iCs w:val="0"/>
+          <w:caps w:val="0"/>
+          <w:smallCaps w:val="0"/>
+          <w:noProof w:val="0"/>
+          <w:color w:val="273540"/>
+          <w:sz w:val="24"/>
+          <w:szCs w:val="24"/>
+          <w:lang w:val="en-US"/>
+        </w:rPr>
+        <w:t xml:space="preserve"> the diurnal decline in salivary cortisol. </w:t>
+      </w:r>
+    </w:p>
+    <w:p xmlns:wp14="http://schemas.microsoft.com/office/word/2010/wordml" wp14:paraId="3311FAA3" wp14:textId="7E1EAD83">
+      <w:pPr>
+        <w:shd w:val="clear" w:color="auto" w:fill="FFFFFF" w:themeFill="background1"/>
+        <w:spacing w:before="180" w:beforeAutospacing="off" w:after="180" w:afterAutospacing="off"/>
+        <w:rPr>
+          <w:rFonts w:ascii="Lato" w:hAnsi="Lato" w:eastAsia="Lato" w:cs="Lato"/>
+          <w:b w:val="0"/>
+          <w:bCs w:val="0"/>
+          <w:i w:val="0"/>
+          <w:iCs w:val="0"/>
+          <w:caps w:val="0"/>
+          <w:smallCaps w:val="0"/>
+          <w:noProof w:val="0"/>
+          <w:color w:val="273540"/>
+          <w:sz w:val="24"/>
+          <w:szCs w:val="24"/>
+          <w:lang w:val="en-US"/>
+        </w:rPr>
+      </w:pPr>
+      <w:r>
+        <w:rPr>
+          <w:rFonts w:ascii="Lato" w:hAnsi="Lato" w:eastAsia="Lato" w:cs="Lato"/>
+          <w:b w:val="1"/>
+          <w:bCs w:val="1"/>
+          <w:i w:val="0"/>
+          <w:iCs w:val="0"/>
+          <w:caps w:val="0"/>
+          <w:smallCaps w:val="0"/>
+          <w:noProof w:val="0"/>
+          <w:color w:val="273540"/>
+          <w:sz w:val="24"/>
+          <w:szCs w:val="24"/>
+          <w:lang w:val="en-US"/>
+        </w:rPr>
+        <w:t>Investigator's Research Question:</w:t>
+      </w:r>
+      <w:r>
+        <w:rPr>
+          <w:rFonts w:ascii="Lato" w:hAnsi="Lato" w:eastAsia="Lato" w:cs="Lato"/>
+          <w:b w:val="0"/>
+          <w:bCs w:val="0"/>
+          <w:i w:val="0"/>
+          <w:iCs w:val="0"/>
+          <w:caps w:val="0"/>
+          <w:smallCaps w:val="0"/>
+          <w:noProof w:val="0"/>
+          <w:color w:val="273540"/>
+          <w:sz w:val="24"/>
+          <w:szCs w:val="24"/>
+          <w:lang w:val="en-US"/>
+        </w:rPr>
+        <w:t xml:space="preserve"> We tested the use of a convenient and novel collection device for collecting saliva on strips of filter paper in a specially constructed booklet for determination of both salivary cortisol and DHEA</w:t>
+      </w:r>
+      <w:r>
+        <w:rPr>
+          <w:rFonts w:ascii="Lato" w:hAnsi="Lato" w:eastAsia="Lato" w:cs="Lato"/>
+          <w:b w:val="0"/>
+          <w:bCs w:val="0"/>
+          <w:i w:val="0"/>
+          <w:iCs w:val="0"/>
+          <w:caps w:val="0"/>
+          <w:smallCaps w:val="0"/>
+          <w:noProof w:val="0"/>
+          <w:color w:val="273540"/>
+          <w:sz w:val="24"/>
+          <w:szCs w:val="24"/>
+          <w:lang w:val="en-US"/>
+        </w:rPr>
+        <w:t xml:space="preserve">.  </w:t>
+      </w:r>
+      <w:r>
+        <w:rPr>
+          <w:rFonts w:ascii="Lato" w:hAnsi="Lato" w:eastAsia="Lato" w:cs="Lato"/>
+          <w:b w:val="0"/>
+          <w:bCs w:val="0"/>
+          <w:i w:val="0"/>
+          <w:iCs w:val="0"/>
+          <w:caps w:val="0"/>
+          <w:smallCaps w:val="0"/>
+          <w:noProof w:val="0"/>
+          <w:color w:val="273540"/>
+          <w:sz w:val="24"/>
+          <w:szCs w:val="24"/>
+          <w:lang w:val="en-US"/>
+        </w:rPr>
+        <w:t xml:space="preserve">In the present study, 31 healthy control subjects collected saliva samples four times a day for three days using the filter paper device (Saliva Procurement and Integrated Testing (SPIT) booklet) which was maintained during the collection period in a large plastic bottle with an electronic monitoring cap. Subjects were asked to collect saliva samples at waking, 30 min later, before lunch and 600 min after waking.  </w:t>
+      </w:r>
+      <w:r>
+        <w:rPr>
+          <w:rFonts w:ascii="Lato" w:hAnsi="Lato" w:eastAsia="Lato" w:cs="Lato"/>
+          <w:b w:val="0"/>
+          <w:bCs w:val="0"/>
+          <w:i w:val="0"/>
+          <w:iCs w:val="0"/>
+          <w:caps w:val="0"/>
+          <w:smallCaps w:val="0"/>
+          <w:noProof w:val="0"/>
+          <w:color w:val="273540"/>
+          <w:sz w:val="24"/>
+          <w:szCs w:val="24"/>
+          <w:lang w:val="en-US"/>
+        </w:rPr>
+        <w:t>The time of waking and the time before lunch were allowed to vary by the subjects’ schedules.</w:t>
+      </w:r>
+    </w:p>
+    <w:p xmlns:wp14="http://schemas.microsoft.com/office/word/2010/wordml" wp14:paraId="2F31CA02" wp14:textId="405C3A3E">
+      <w:pPr>
+        <w:shd w:val="clear" w:color="auto" w:fill="FFFFFF" w:themeFill="background1"/>
+        <w:spacing w:before="180" w:beforeAutospacing="off" w:after="180" w:afterAutospacing="off"/>
+      </w:pPr>
+      <w:r>
+        <w:rPr>
+          <w:rFonts w:ascii="Lato" w:hAnsi="Lato" w:eastAsia="Lato" w:cs="Lato"/>
+          <w:b w:val="1"/>
+          <w:bCs w:val="1"/>
+          <w:i w:val="0"/>
+          <w:iCs w:val="0"/>
+          <w:caps w:val="0"/>
+          <w:smallCaps w:val="0"/>
+          <w:noProof w:val="0"/>
+          <w:color w:val="273540"/>
+          <w:sz w:val="24"/>
+          <w:szCs w:val="24"/>
+          <w:lang w:val="en-US"/>
+        </w:rPr>
+        <w:t>Our questions are: 1) what is the agreement between the subject’s recordings of sampling times compared to the times recorded by an electronic monitoring cap?, 2) are subjects adhering accurately to the +30min and +10 hour sampling times required by a study protocol?, 3) what are the changes of cortisol and DHEA over time?</w:t>
+      </w:r>
+    </w:p>
+    <w:p xmlns:wp14="http://schemas.microsoft.com/office/word/2010/wordml" wp14:paraId="0D3F7933" wp14:textId="2D42D2F4">
+      <w:pPr>
+        <w:shd w:val="clear" w:color="auto" w:fill="FFFFFF" w:themeFill="background1"/>
+        <w:spacing w:before="180" w:beforeAutospacing="off" w:after="180" w:afterAutospacing="off"/>
+        <w:rPr>
+          <w:rFonts w:ascii="Lato" w:hAnsi="Lato" w:eastAsia="Lato" w:cs="Lato"/>
+          <w:b w:val="1"/>
+          <w:bCs w:val="1"/>
+          <w:i w:val="0"/>
+          <w:iCs w:val="0"/>
+          <w:caps w:val="0"/>
+          <w:smallCaps w:val="0"/>
+          <w:noProof w:val="0"/>
+          <w:color w:val="273540"/>
+          <w:sz w:val="24"/>
+          <w:szCs w:val="24"/>
+          <w:lang w:val="en-US"/>
+        </w:rPr>
+      </w:pPr>
+      <w:r>
+        <w:rPr>
+          <w:rFonts w:ascii="Lato" w:hAnsi="Lato" w:eastAsia="Lato" w:cs="Lato"/>
+          <w:b w:val="1"/>
+          <w:bCs w:val="1"/>
+          <w:i w:val="0"/>
+          <w:iCs w:val="0"/>
+          <w:caps w:val="0"/>
+          <w:smallCaps w:val="0"/>
+          <w:noProof w:val="0"/>
+          <w:color w:val="273540"/>
+          <w:sz w:val="24"/>
+          <w:szCs w:val="24"/>
+          <w:lang w:val="en-US"/>
+        </w:rPr>
+        <w:t>Variable definitions:</w:t>
+      </w:r>
+    </w:p>
+    <w:p xmlns:wp14="http://schemas.microsoft.com/office/word/2010/wordml" wp14:paraId="540E45BE" wp14:textId="614E3883">
+      <w:pPr>
+        <w:shd w:val="clear" w:color="auto" w:fill="FFFFFF" w:themeFill="background1"/>
+        <w:spacing w:before="180" w:beforeAutospacing="off" w:after="180" w:afterAutospacing="off"/>
+      </w:pPr>
+      <w:r>
+        <w:rPr>
+          <w:rFonts w:ascii="Lato" w:hAnsi="Lato" w:eastAsia="Lato" w:cs="Lato"/>
+          <w:b w:val="0"/>
+          <w:bCs w:val="0"/>
+          <w:i w:val="0"/>
+          <w:iCs w:val="0"/>
+          <w:caps w:val="0"/>
+          <w:smallCaps w:val="0"/>
+          <w:noProof w:val="0"/>
+          <w:color w:val="273540"/>
+          <w:sz w:val="24"/>
+          <w:szCs w:val="24"/>
+          <w:lang w:val="en-US"/>
+        </w:rPr>
+        <w:t>Subjectid: Subject number</w:t>
+      </w:r>
+    </w:p>
+    <w:p xmlns:wp14="http://schemas.microsoft.com/office/word/2010/wordml" wp14:paraId="5248BC53" wp14:textId="2EBEA712">
+      <w:pPr>
+        <w:shd w:val="clear" w:color="auto" w:fill="FFFFFF" w:themeFill="background1"/>
+        <w:spacing w:before="180" w:beforeAutospacing="off" w:after="180" w:afterAutospacing="off"/>
+      </w:pPr>
+      <w:r>
+        <w:rPr>
+          <w:rFonts w:ascii="Lato" w:hAnsi="Lato" w:eastAsia="Lato" w:cs="Lato"/>
+          <w:b w:val="0"/>
+          <w:bCs w:val="0"/>
+          <w:i w:val="0"/>
+          <w:iCs w:val="0"/>
+          <w:caps w:val="0"/>
+          <w:smallCaps w:val="0"/>
+          <w:noProof w:val="0"/>
+          <w:color w:val="273540"/>
+          <w:sz w:val="24"/>
+          <w:szCs w:val="24"/>
+          <w:lang w:val="en-US"/>
+        </w:rPr>
+        <w:t>CollectionDate: Date of sample collection formatted as mm/dd/yyyy</w:t>
+      </w:r>
+    </w:p>
+    <w:p xmlns:wp14="http://schemas.microsoft.com/office/word/2010/wordml" wp14:paraId="2799EE22" wp14:textId="09D60886">
+      <w:pPr>
+        <w:shd w:val="clear" w:color="auto" w:fill="FFFFFF" w:themeFill="background1"/>
+        <w:spacing w:before="180" w:beforeAutospacing="off" w:after="180" w:afterAutospacing="off"/>
+      </w:pPr>
+      <w:r>
+        <w:rPr>
+          <w:rFonts w:ascii="Lato" w:hAnsi="Lato" w:eastAsia="Lato" w:cs="Lato"/>
+          <w:b w:val="0"/>
+          <w:bCs w:val="0"/>
+          <w:i w:val="0"/>
+          <w:iCs w:val="0"/>
+          <w:caps w:val="0"/>
+          <w:smallCaps w:val="0"/>
+          <w:noProof w:val="0"/>
+          <w:color w:val="273540"/>
+          <w:sz w:val="24"/>
+          <w:szCs w:val="24"/>
+          <w:lang w:val="en-US"/>
+        </w:rPr>
+        <w:t>Collection Sample: ordering of samples over the day ranging from 1-4. 1 is at waking, 2 ~30 min from waking, 3 at ~lunch and 4 at ~10 hours after waking.</w:t>
+      </w:r>
+    </w:p>
+    <w:p xmlns:wp14="http://schemas.microsoft.com/office/word/2010/wordml" wp14:paraId="27597DE7" wp14:textId="7425CDAC">
+      <w:pPr>
+        <w:shd w:val="clear" w:color="auto" w:fill="FFFFFF" w:themeFill="background1"/>
+        <w:spacing w:before="180" w:beforeAutospacing="off" w:after="180" w:afterAutospacing="off"/>
+      </w:pPr>
+      <w:r>
+        <w:rPr>
+          <w:rFonts w:ascii="Lato" w:hAnsi="Lato" w:eastAsia="Lato" w:cs="Lato"/>
+          <w:b w:val="0"/>
+          <w:bCs w:val="0"/>
+          <w:i w:val="0"/>
+          <w:iCs w:val="0"/>
+          <w:caps w:val="0"/>
+          <w:smallCaps w:val="0"/>
+          <w:noProof w:val="0"/>
+          <w:color w:val="273540"/>
+          <w:sz w:val="24"/>
+          <w:szCs w:val="24"/>
+          <w:lang w:val="en-US"/>
+        </w:rPr>
+        <w:t>Booklet: Clock time: Time of day of sample collection noted by participant formatted as hh:mm in military time.</w:t>
+      </w:r>
+    </w:p>
+    <w:p xmlns:wp14="http://schemas.microsoft.com/office/word/2010/wordml" wp14:paraId="21B98ADA" wp14:textId="1446F29E">
+      <w:pPr>
+        <w:shd w:val="clear" w:color="auto" w:fill="FFFFFF" w:themeFill="background1"/>
+        <w:spacing w:before="180" w:beforeAutospacing="off" w:after="180" w:afterAutospacing="off"/>
+      </w:pPr>
+      <w:r>
+        <w:rPr>
+          <w:rFonts w:ascii="Lato" w:hAnsi="Lato" w:eastAsia="Lato" w:cs="Lato"/>
+          <w:b w:val="0"/>
+          <w:bCs w:val="0"/>
+          <w:i w:val="0"/>
+          <w:iCs w:val="0"/>
+          <w:caps w:val="0"/>
+          <w:smallCaps w:val="0"/>
+          <w:noProof w:val="0"/>
+          <w:color w:val="273540"/>
+          <w:sz w:val="24"/>
+          <w:szCs w:val="24"/>
+          <w:lang w:val="en-US"/>
+        </w:rPr>
+        <w:t>MEMs: Clock time: Time of day of sample collection by electronic cap stamp formatted as hh:mm in military time.</w:t>
+      </w:r>
+    </w:p>
+    <w:p xmlns:wp14="http://schemas.microsoft.com/office/word/2010/wordml" wp14:paraId="38CDA48D" wp14:textId="13F3B5EA">
+      <w:pPr>
+        <w:shd w:val="clear" w:color="auto" w:fill="FFFFFF" w:themeFill="background1"/>
+        <w:spacing w:before="180" w:beforeAutospacing="off" w:after="180" w:afterAutospacing="off"/>
+      </w:pPr>
+      <w:r>
+        <w:rPr>
+          <w:rFonts w:ascii="Lato" w:hAnsi="Lato" w:eastAsia="Lato" w:cs="Lato"/>
+          <w:b w:val="0"/>
+          <w:bCs w:val="0"/>
+          <w:i w:val="0"/>
+          <w:iCs w:val="0"/>
+          <w:caps w:val="0"/>
+          <w:smallCaps w:val="0"/>
+          <w:noProof w:val="0"/>
+          <w:color w:val="273540"/>
+          <w:sz w:val="24"/>
+          <w:szCs w:val="24"/>
+          <w:lang w:val="en-US"/>
+        </w:rPr>
+        <w:t>Sleep Diary reported wake time: Time of day of waking formatted as hh:mm in military time.</w:t>
+      </w:r>
+    </w:p>
+    <w:p xmlns:wp14="http://schemas.microsoft.com/office/word/2010/wordml" wp14:paraId="4F6C7642" wp14:textId="4D4CBAD7">
+      <w:pPr>
+        <w:shd w:val="clear" w:color="auto" w:fill="FFFFFF" w:themeFill="background1"/>
+        <w:spacing w:before="180" w:beforeAutospacing="off" w:after="180" w:afterAutospacing="off"/>
+      </w:pPr>
+      <w:r>
+        <w:rPr>
+          <w:rFonts w:ascii="Lato" w:hAnsi="Lato" w:eastAsia="Lato" w:cs="Lato"/>
+          <w:b w:val="0"/>
+          <w:bCs w:val="0"/>
+          <w:i w:val="0"/>
+          <w:iCs w:val="0"/>
+          <w:caps w:val="0"/>
+          <w:smallCaps w:val="0"/>
+          <w:noProof w:val="0"/>
+          <w:color w:val="273540"/>
+          <w:sz w:val="24"/>
+          <w:szCs w:val="24"/>
+          <w:lang w:val="en-US"/>
+        </w:rPr>
+        <w:t>Booklet: Sample interval: Number of hours and minutes from waking recorded by participant formatted as hh:mm where waking was recorded as midnight 00:00</w:t>
+      </w:r>
+    </w:p>
+    <w:p xmlns:wp14="http://schemas.microsoft.com/office/word/2010/wordml" wp14:paraId="11BE4BB4" wp14:textId="0FD398D5">
+      <w:pPr>
+        <w:shd w:val="clear" w:color="auto" w:fill="FFFFFF" w:themeFill="background1"/>
+        <w:spacing w:before="180" w:beforeAutospacing="off" w:after="180" w:afterAutospacing="off"/>
+      </w:pPr>
+      <w:r>
+        <w:rPr>
+          <w:rFonts w:ascii="Lato" w:hAnsi="Lato" w:eastAsia="Lato" w:cs="Lato"/>
+          <w:b w:val="0"/>
+          <w:bCs w:val="0"/>
+          <w:i w:val="0"/>
+          <w:iCs w:val="0"/>
+          <w:caps w:val="0"/>
+          <w:smallCaps w:val="0"/>
+          <w:noProof w:val="0"/>
+          <w:color w:val="273540"/>
+          <w:sz w:val="24"/>
+          <w:szCs w:val="24"/>
+          <w:lang w:val="en-US"/>
+        </w:rPr>
+        <w:t>Booklet: Sample interval Decimal Time (mins): Number of minutes from waking for the sample as recorded by participant.</w:t>
+      </w:r>
+    </w:p>
+    <w:p xmlns:wp14="http://schemas.microsoft.com/office/word/2010/wordml" wp14:paraId="283935E2" wp14:textId="74E9D464">
+      <w:pPr>
+        <w:shd w:val="clear" w:color="auto" w:fill="FFFFFF" w:themeFill="background1"/>
+        <w:spacing w:before="180" w:beforeAutospacing="off" w:after="180" w:afterAutospacing="off"/>
+      </w:pPr>
+      <w:r>
+        <w:rPr>
+          <w:rFonts w:ascii="Lato" w:hAnsi="Lato" w:eastAsia="Lato" w:cs="Lato"/>
+          <w:b w:val="0"/>
+          <w:bCs w:val="0"/>
+          <w:i w:val="0"/>
+          <w:iCs w:val="0"/>
+          <w:caps w:val="0"/>
+          <w:smallCaps w:val="0"/>
+          <w:noProof w:val="0"/>
+          <w:color w:val="273540"/>
+          <w:sz w:val="24"/>
+          <w:szCs w:val="24"/>
+          <w:lang w:val="en-US"/>
+        </w:rPr>
+        <w:t>MEMs: Sample interval: Number of hours and minutes from waking electronic cap stamp formatted as hh:mm where waking was recorded as midnight 00:00</w:t>
+      </w:r>
+    </w:p>
+    <w:p xmlns:wp14="http://schemas.microsoft.com/office/word/2010/wordml" wp14:paraId="438E4431" wp14:textId="611437F8">
+      <w:pPr>
+        <w:shd w:val="clear" w:color="auto" w:fill="FFFFFF" w:themeFill="background1"/>
+        <w:spacing w:before="180" w:beforeAutospacing="off" w:after="180" w:afterAutospacing="off"/>
+      </w:pPr>
+      <w:r>
+        <w:rPr>
+          <w:rFonts w:ascii="Lato" w:hAnsi="Lato" w:eastAsia="Lato" w:cs="Lato"/>
+          <w:b w:val="0"/>
+          <w:bCs w:val="0"/>
+          <w:i w:val="0"/>
+          <w:iCs w:val="0"/>
+          <w:caps w:val="0"/>
+          <w:smallCaps w:val="0"/>
+          <w:noProof w:val="0"/>
+          <w:color w:val="273540"/>
+          <w:sz w:val="24"/>
+          <w:szCs w:val="24"/>
+          <w:lang w:val="en-US"/>
+        </w:rPr>
+        <w:t>MEMs: Sample interval Decimal Time (mins): Number of minutes from waking electronic stamp.</w:t>
+      </w:r>
+    </w:p>
+    <w:p xmlns:wp14="http://schemas.microsoft.com/office/word/2010/wordml" wp14:paraId="18BA2FBF" wp14:textId="7E371C54">
+      <w:pPr>
+        <w:shd w:val="clear" w:color="auto" w:fill="FFFFFF" w:themeFill="background1"/>
+        <w:spacing w:before="180" w:beforeAutospacing="off" w:after="180" w:afterAutospacing="off"/>
+      </w:pPr>
+      <w:r>
+        <w:rPr>
+          <w:rFonts w:ascii="Lato" w:hAnsi="Lato" w:eastAsia="Lato" w:cs="Lato"/>
+          <w:b w:val="0"/>
+          <w:bCs w:val="0"/>
+          <w:i w:val="0"/>
+          <w:iCs w:val="0"/>
+          <w:caps w:val="0"/>
+          <w:smallCaps w:val="0"/>
+          <w:noProof w:val="0"/>
+          <w:color w:val="273540"/>
+          <w:sz w:val="24"/>
+          <w:szCs w:val="24"/>
+          <w:lang w:val="en-US"/>
+        </w:rPr>
+        <w:t>Cortisol (ug/dl): Cortisol levels in nanograms/deciliter units.</w:t>
+      </w:r>
+    </w:p>
+    <w:p xmlns:wp14="http://schemas.microsoft.com/office/word/2010/wordml" wp14:paraId="240E4F6E" wp14:textId="026E2233">
+      <w:pPr>
+        <w:shd w:val="clear" w:color="auto" w:fill="FFFFFF" w:themeFill="background1"/>
+        <w:spacing w:before="180" w:beforeAutospacing="off" w:after="180" w:afterAutospacing="off"/>
+      </w:pPr>
+      <w:r>
+        <w:rPr>
+          <w:rFonts w:ascii="Lato" w:hAnsi="Lato" w:eastAsia="Lato" w:cs="Lato"/>
+          <w:b w:val="0"/>
+          <w:bCs w:val="0"/>
+          <w:i w:val="0"/>
+          <w:iCs w:val="0"/>
+          <w:caps w:val="0"/>
+          <w:smallCaps w:val="0"/>
+          <w:noProof w:val="0"/>
+          <w:color w:val="273540"/>
+          <w:sz w:val="24"/>
+          <w:szCs w:val="24"/>
+          <w:lang w:val="en-US"/>
+        </w:rPr>
+        <w:t>DHEA (pg/dl): DHEA levels in picograms/deciliter units.</w:t>
+      </w:r>
+    </w:p>
+    <w:p xmlns:wp14="http://schemas.microsoft.com/office/word/2010/wordml" wp14:paraId="3D263556" wp14:textId="3C07D690">
+      <w:pPr>
+        <w:shd w:val="clear" w:color="auto" w:fill="FFFFFF" w:themeFill="background1"/>
+        <w:spacing w:before="180" w:beforeAutospacing="off" w:after="180" w:afterAutospacing="off"/>
+      </w:pPr>
+      <w:r>
+        <w:rPr>
+          <w:rFonts w:ascii="Lato" w:hAnsi="Lato" w:eastAsia="Lato" w:cs="Lato"/>
+          <w:b w:val="0"/>
+          <w:bCs w:val="0"/>
+          <w:i w:val="0"/>
+          <w:iCs w:val="0"/>
+          <w:caps w:val="0"/>
+          <w:smallCaps w:val="0"/>
+          <w:noProof w:val="0"/>
+          <w:color w:val="273540"/>
+          <w:sz w:val="24"/>
+          <w:szCs w:val="24"/>
+          <w:lang w:val="en-US"/>
+        </w:rPr>
+        <w:t>Cortisol (nmol/L): Cortisol levels in a different unit.</w:t>
+      </w:r>
+    </w:p>
+    <w:p xmlns:wp14="http://schemas.microsoft.com/office/word/2010/wordml" wp14:paraId="39C1B98E" wp14:textId="53F32AFB">
+      <w:pPr>
+        <w:shd w:val="clear" w:color="auto" w:fill="FFFFFF" w:themeFill="background1"/>
+        <w:spacing w:before="180" w:beforeAutospacing="off" w:after="180" w:afterAutospacing="off"/>
+      </w:pPr>
+      <w:r>
+        <w:rPr>
+          <w:rFonts w:ascii="Lato" w:hAnsi="Lato" w:eastAsia="Lato" w:cs="Lato"/>
+          <w:b w:val="0"/>
+          <w:bCs w:val="0"/>
+          <w:i w:val="0"/>
+          <w:iCs w:val="0"/>
+          <w:caps w:val="0"/>
+          <w:smallCaps w:val="0"/>
+          <w:noProof w:val="0"/>
+          <w:color w:val="273540"/>
+          <w:sz w:val="24"/>
+          <w:szCs w:val="24"/>
+          <w:lang w:val="en-US"/>
+        </w:rPr>
+        <w:t>DHEA (nmol/L): DHEA levels in a different unit.</w:t>
+      </w:r>
+    </w:p>
+    <w:p xmlns:wp14="http://schemas.microsoft.com/office/word/2010/wordml" wp14:paraId="7DE94F8D" wp14:textId="3A2F393B">
+      <w:pPr>
+        <w:shd w:val="clear" w:color="auto" w:fill="FFFFFF" w:themeFill="background1"/>
+        <w:spacing w:before="180" w:beforeAutospacing="off" w:after="180" w:afterAutospacing="off"/>
+      </w:pPr>
+      <w:r>
+        <w:rPr>
+          <w:rFonts w:ascii="Lato" w:hAnsi="Lato" w:eastAsia="Lato" w:cs="Lato"/>
+          <w:b w:val="0"/>
+          <w:bCs w:val="0"/>
+          <w:i w:val="0"/>
+          <w:iCs w:val="0"/>
+          <w:caps w:val="0"/>
+          <w:smallCaps w:val="0"/>
+          <w:noProof w:val="0"/>
+          <w:color w:val="273540"/>
+          <w:sz w:val="24"/>
+          <w:szCs w:val="24"/>
+          <w:lang w:val="en-US"/>
+        </w:rPr>
+        <w:t>DAYNUMBER: Number of the day samples were collected. 1-3 days.</w:t>
+      </w:r>
+    </w:p>
+    <w:p xmlns:wp14="http://schemas.microsoft.com/office/word/2010/wordml" wp14:paraId="5044E9EF" wp14:textId="4E24EBD0"/>
+    <w:p xmlns:wp14="http://schemas.microsoft.com/office/word/2010/wordml" wp14:paraId="2C078E63" wp14:textId="19571C0E"/>
     <w:sectPr>
-      <w:pgSz w:w="12240" w:h="15840"/>
+      <w:pgSz w:w="12240" w:h="15840" w:orient="portrait"/>
       <w:pgMar w:top="1440" w:right="1440" w:bottom="1440" w:left="1440" w:header="720" w:footer="720" w:gutter="0"/>
       <w:cols w:space="720"/>
       <w:docGrid w:linePitch="360"/>
@@ -480,7 +1133,7 @@
     </a:clrScheme>
     <a:fontScheme name="Office">
       <a:majorFont>
-        <a:latin typeface="Aptos Display" panose="02110004020202020204"/>
+        <a:latin typeface="Aptos Display"/>
         <a:ea typeface=""/>
         <a:cs typeface=""/>
         <a:font script="Jpan" typeface="ＭＳ ゴシック"/>
@@ -515,7 +1168,7 @@
         <a:font script="Geor" typeface="Sylfaen"/>
       </a:majorFont>
       <a:minorFont>
-        <a:latin typeface="Aptos" panose="02110004020202020204"/>
+        <a:latin typeface="Times New Roman"/>
         <a:ea typeface=""/>
         <a:cs typeface=""/>
         <a:font script="Jpan" typeface="ＭＳ 明朝"/>

</xml_diff>